<commit_message>
atualização do texto opinativo
</commit_message>
<xml_diff>
--- a/output_final/Uma política de fomento baseada em evidências_v6.docx
+++ b/output_final/Uma política de fomento baseada em evidências_v6.docx
@@ -171,42 +171,146 @@
     <w:p>
       <w:r>
         <w:lastRenderedPageBreak/>
-        <w:t xml:space="preserve">Eu fiquei muito dividido em como organizar o texto entre </w:t>
-      </w:r>
-      <w:r>
-        <w:t>análise</w:t>
-      </w:r>
-      <w:r>
-        <w:t xml:space="preserve"> de dados e opinião. Acredito que o ideal seria primeiro navegar pelo painel de dados. Tem uma curadoria ali</w:t>
-      </w:r>
-      <w:r>
-        <w:t>,</w:t>
-      </w:r>
-      <w:r>
-        <w:t xml:space="preserve"> então </w:t>
-      </w:r>
-      <w:r>
-        <w:t>está</w:t>
-      </w:r>
-      <w:r>
-        <w:t xml:space="preserve"> bem alinhado com esse texto.</w:t>
-      </w:r>
-      <w:r>
-        <w:t xml:space="preserve"> E</w:t>
-      </w:r>
-      <w:r>
-        <w:t>ntão</w:t>
-      </w:r>
-      <w:r>
-        <w:t xml:space="preserve"> tentei criar um texto duplo, vou deixar os argumentos e opiniões aqui e vou linkando </w:t>
-      </w:r>
+        <w:t>O meu objetivo inicial era explorar os dados a partir de uma pergunta principal</w:t>
+      </w:r>
+      <w:r>
+        <w:t>:</w:t>
+      </w:r>
+    </w:p>
+    <w:p>
+      <w:pPr>
+        <w:pStyle w:val="PargrafodaLista"/>
+        <w:numPr>
+          <w:ilvl w:val="0"/>
+          <w:numId w:val="22"/>
+        </w:numPr>
+      </w:pPr>
+      <w:r>
+        <w:t>Qual é a metodologia de decisão de investimento que traz os melhores resultados nas duas principais dimensões de avaliação</w:t>
+      </w:r>
+      <w:r>
+        <w:t>:</w:t>
+      </w:r>
+      <w:r>
+        <w:t xml:space="preserve"> desempenho doméstico e desempenho internacional?</w:t>
+      </w:r>
+    </w:p>
+    <w:p>
+      <w:r>
+        <w:t>Acontece que não tem como rondar esse tema tão estrutural sem esbarrar consequentemente em outras tantas</w:t>
+      </w:r>
+      <w:r>
+        <w:t xml:space="preserve"> perguntas que foram surgindo durante o caminho</w:t>
+      </w:r>
+      <w:r>
+        <w:t>:</w:t>
+      </w:r>
+    </w:p>
+    <w:p>
+      <w:pPr>
+        <w:pStyle w:val="PargrafodaLista"/>
+        <w:numPr>
+          <w:ilvl w:val="0"/>
+          <w:numId w:val="21"/>
+        </w:numPr>
+      </w:pPr>
+      <w:r>
+        <w:t>Como o FSA interage com outros mecanismos de investimento como a renúncia fiscal?</w:t>
+      </w:r>
+    </w:p>
+    <w:p>
+      <w:pPr>
+        <w:pStyle w:val="PargrafodaLista"/>
+        <w:numPr>
+          <w:ilvl w:val="0"/>
+          <w:numId w:val="21"/>
+        </w:numPr>
+      </w:pPr>
+      <w:r>
+        <w:t>Qual é a distribuição de desempenho entre as produtoras?</w:t>
+      </w:r>
+    </w:p>
+    <w:p>
+      <w:pPr>
+        <w:pStyle w:val="PargrafodaLista"/>
+        <w:numPr>
+          <w:ilvl w:val="0"/>
+          <w:numId w:val="21"/>
+        </w:numPr>
+      </w:pPr>
+      <w:r>
+        <w:t>Qual é a distribuição de investimento entre as produtoras?</w:t>
+      </w:r>
+    </w:p>
+    <w:p>
+      <w:pPr>
+        <w:pStyle w:val="PargrafodaLista"/>
+        <w:numPr>
+          <w:ilvl w:val="0"/>
+          <w:numId w:val="21"/>
+        </w:numPr>
+      </w:pPr>
+      <w:r>
+        <w:t>Entre concentração e dispersão dessas duas métricas, como ficaria a sustentabilidade do elo da produção?</w:t>
+      </w:r>
+    </w:p>
+    <w:p>
+      <w:pPr>
+        <w:pStyle w:val="PargrafodaLista"/>
+        <w:numPr>
+          <w:ilvl w:val="0"/>
+          <w:numId w:val="21"/>
+        </w:numPr>
+      </w:pPr>
+      <w:r>
+        <w:t>As metodologias atuais criam barreiras de entrada a novos entrantes?</w:t>
+      </w:r>
+    </w:p>
+    <w:p>
+      <w:pPr>
+        <w:pStyle w:val="PargrafodaLista"/>
+        <w:numPr>
+          <w:ilvl w:val="0"/>
+          <w:numId w:val="21"/>
+        </w:numPr>
+      </w:pPr>
+      <w:r>
+        <w:t>Quais seriam opções para diminuir as barreiras de entrada em um fomento baseado em desempenho pretérito? Os curtas poderiam apresentar uma resposta para isso?</w:t>
+      </w:r>
+    </w:p>
+    <w:p>
+      <w:pPr>
+        <w:pStyle w:val="PargrafodaLista"/>
+        <w:numPr>
+          <w:ilvl w:val="0"/>
+          <w:numId w:val="21"/>
+        </w:numPr>
+      </w:pPr>
       <w:proofErr w:type="gramStart"/>
       <w:r>
-        <w:t>aonde</w:t>
+        <w:t xml:space="preserve">As políticas afirmativas tentadas até agora </w:t>
+      </w:r>
+      <w:r>
+        <w:t>tem</w:t>
       </w:r>
       <w:proofErr w:type="gramEnd"/>
       <w:r>
-        <w:t xml:space="preserve"> estão os dados que embasam cada afirmação. </w:t>
+        <w:t xml:space="preserve"> potencial para</w:t>
+      </w:r>
+      <w:r>
+        <w:t xml:space="preserve"> reduzir a desigualdade de oportunidades entre gênero e raça?</w:t>
+      </w:r>
+    </w:p>
+    <w:p>
+      <w:pPr>
+        <w:pStyle w:val="PargrafodaLista"/>
+        <w:numPr>
+          <w:ilvl w:val="0"/>
+          <w:numId w:val="21"/>
+        </w:numPr>
+      </w:pPr>
+      <w:r>
+        <w:t>Quais outras métricas poderiam ser usadas para medir Soft Power gerado pelas obras fomentadas?</w:t>
       </w:r>
     </w:p>
     <w:p/>
@@ -226,7 +330,25 @@
           <w:sz w:val="28"/>
           <w:szCs w:val="28"/>
         </w:rPr>
-        <w:t xml:space="preserve">O que determina o sucesso em cinema </w:t>
+        <w:t>O que determina o sucesso em</w:t>
+      </w:r>
+      <w:r>
+        <w:rPr>
+          <w:b/>
+          <w:bCs/>
+          <w:sz w:val="28"/>
+          <w:szCs w:val="28"/>
+        </w:rPr>
+        <w:t xml:space="preserve"> salas</w:t>
+      </w:r>
+      <w:r>
+        <w:rPr>
+          <w:b/>
+          <w:bCs/>
+          <w:sz w:val="28"/>
+          <w:szCs w:val="28"/>
+        </w:rPr>
+        <w:t xml:space="preserve"> cinema </w:t>
       </w:r>
       <w:r>
         <w:rPr>
@@ -323,6 +445,7 @@
     </w:p>
     <w:p>
       <w:r>
+        <w:lastRenderedPageBreak/>
         <w:t>Eu tentei explorar por várias óticas e não cheguei em nada conclusivo além de</w:t>
       </w:r>
       <w:r>
@@ -388,7 +511,6 @@
         <w:rPr>
           <w:lang w:val="pt-BR"/>
         </w:rPr>
-        <w:lastRenderedPageBreak/>
         <w:t>• Tem um custo burocrático significativo em acompanhamento e prestação de contas para a Ancine;</w:t>
       </w:r>
     </w:p>
@@ -472,6 +594,10 @@
     </w:p>
     <w:p>
       <w:r>
+        <w:rPr>
+          <w:noProof/>
+        </w:rPr>
+        <w:lastRenderedPageBreak/>
         <w:drawing>
           <wp:inline distT="0" distB="0" distL="0" distR="0" wp14:anchorId="1FA9B092" wp14:editId="2B30F433">
             <wp:extent cx="5486400" cy="2543175"/>
@@ -555,22 +681,46 @@
     </w:p>
     <w:p>
       <w:r>
-        <w:t xml:space="preserve">Embora o </w:t>
-      </w:r>
-      <w:proofErr w:type="gramStart"/>
-      <w:r>
-        <w:t>automático festivais</w:t>
-      </w:r>
-      <w:proofErr w:type="gramEnd"/>
+        <w:t xml:space="preserve">Embora </w:t>
+      </w:r>
+      <w:r>
+        <w:t>a categoria</w:t>
+      </w:r>
+      <w:r>
+        <w:t xml:space="preserve"> </w:t>
+      </w:r>
+      <w:r>
+        <w:t>“A</w:t>
+      </w:r>
+      <w:r>
+        <w:t xml:space="preserve">utomático </w:t>
+      </w:r>
+      <w:r>
+        <w:t>F</w:t>
+      </w:r>
+      <w:r>
+        <w:t>estivais</w:t>
+      </w:r>
+      <w:r>
+        <w:t>”</w:t>
+      </w:r>
       <w:r>
         <w:t xml:space="preserve"> pareça</w:t>
       </w:r>
       <w:r>
-        <w:t xml:space="preserve"> com um resultado quase de outlier é importante destacar que por uma característica desses editais é difícil apurar 100% de onde o recurso foi parar, então esse resultado é sobre uma quantidade muito pequena de obras. </w:t>
-      </w:r>
-      <w:r>
-        <w:lastRenderedPageBreak/>
-        <w:t>Pontuação Festivais e Roteiro tem um resultado muito mais confiável e confirma a capacidade de selecionar com viés a internacionalização. E a comparação entre seletivos e automáticos que usam bilheteria de critério mostram um resultado sensivelmente superior para os primeiros.</w:t>
+        <w:t xml:space="preserve"> com um resultado quase de outlier é importante destacar que por uma característica desses editais é difícil </w:t>
+      </w:r>
+      <w:r>
+        <w:t>detectar 100% da destinação desses recursos</w:t>
+      </w:r>
+      <w:r>
+        <w:t xml:space="preserve">, então esse resultado é sobre uma quantidade muito pequena de obras. Pontuação Festivais e Roteiro tem um resultado muito mais confiável e confirma a capacidade de selecionar com viés </w:t>
+      </w:r>
+      <w:r>
+        <w:t>à</w:t>
+      </w:r>
+      <w:r>
+        <w:t xml:space="preserve"> internacionalização. E a comparação entre seletivos e automáticos que usam bilheteria de critério mostram um resultado sensivelmente superior para os primeiros.</w:t>
       </w:r>
     </w:p>
     <w:p>
@@ -662,7 +812,16 @@
     </w:p>
     <w:p>
       <w:r>
-        <w:t xml:space="preserve">Enquanto as de perfil doméstico como proponentes selecionaram grandes sucessos como </w:t>
+        <w:t>As distribuidoras</w:t>
+      </w:r>
+      <w:r>
+        <w:t xml:space="preserve"> de perfil doméstico </w:t>
+      </w:r>
+      <w:r>
+        <w:t>s</w:t>
+      </w:r>
+      <w:r>
+        <w:t xml:space="preserve">elecionaram grandes sucessos como </w:t>
       </w:r>
       <w:r>
         <w:t xml:space="preserve">Minha Mãe é Uma Peça, Loucas </w:t>
@@ -692,22 +851,74 @@
         <w:t xml:space="preserve"> Ar</w:t>
       </w:r>
       <w:r>
-        <w:t>. E aqui cabe um alerta importante, reparem q</w:t>
-      </w:r>
-      <w:r>
-        <w:t>ue as sequências desses filmes não estão aqui. Claramente o poder público entra com o investimento de maior risco descobrindo esses novos sucessos. E para as sequências, de sucesso mais garantido, as produtoras optam por não usar FSA e só financiam as obras através de renúncia fiscal (inflando o resultado desse último). A estratégia é clara, na sequência</w:t>
+        <w:t>. E</w:t>
+      </w:r>
+      <w:r>
+        <w:t>mbora</w:t>
+      </w:r>
+      <w:r>
+        <w:t xml:space="preserve"> aqui ca</w:t>
+      </w:r>
+      <w:r>
+        <w:t>iba</w:t>
+      </w:r>
+      <w:r>
+        <w:t xml:space="preserve"> um alerta importante</w:t>
+      </w:r>
+      <w:r>
+        <w:t>:</w:t>
       </w:r>
       <w:r>
         <w:t xml:space="preserve"> </w:t>
       </w:r>
       <w:r>
+        <w:t xml:space="preserve">as sequências desses filmes não estão </w:t>
+      </w:r>
+      <w:r>
+        <w:t xml:space="preserve">nesta lista, estão na </w:t>
+      </w:r>
+      <w:r>
+        <w:lastRenderedPageBreak/>
+        <w:t>lista de “Renúncia Pura”</w:t>
+      </w:r>
+      <w:r>
+        <w:t xml:space="preserve">. Claramente o poder público entra com o investimento de maior risco </w:t>
+      </w:r>
+      <w:r>
+        <w:t>“revelando”</w:t>
+      </w:r>
+      <w:r>
+        <w:t xml:space="preserve"> esses novos sucessos. E para as sequências, de </w:t>
+      </w:r>
+      <w:r>
+        <w:t>retorno</w:t>
+      </w:r>
+      <w:r>
+        <w:t xml:space="preserve"> mais garantido, as </w:t>
+      </w:r>
+      <w:r>
+        <w:t>distribuidoras/</w:t>
+      </w:r>
+      <w:r>
+        <w:t>produtoras optam por não usar FSA e só financiam as obras através de renúncia fiscal (inflando o resultado desse último). A estratégia é clara, na sequência</w:t>
+      </w:r>
+      <w:r>
+        <w:t xml:space="preserve"> </w:t>
+      </w:r>
+      <w:r>
         <w:t>não us</w:t>
       </w:r>
       <w:r>
         <w:t>a</w:t>
       </w:r>
       <w:r>
-        <w:t xml:space="preserve"> FSA para não dividir com o fundo o resultado de menor risco. Se fossem recursos de reinvestimento estaria ótimo, mas na verdade continuam sendo recursos públicos, só que por um mecanismo que não prevê devolução das receitas</w:t>
+        <w:t xml:space="preserve"> FSA para não dividir com o fundo o </w:t>
+      </w:r>
+      <w:r>
+        <w:t>retorno</w:t>
+      </w:r>
+      <w:r>
+        <w:t xml:space="preserve"> de menor risco. Se fossem recursos de reinvestimento estaria ótimo, mas na verdade continuam sendo recursos públicos, só que por um mecanismo que não prevê devolução das receitas</w:t>
       </w:r>
       <w:r>
         <w:t xml:space="preserve"> com o poder público</w:t>
@@ -757,7 +968,19 @@
         <w:t>s</w:t>
       </w:r>
       <w:r>
-        <w:t xml:space="preserve">, usaram seus resultados de bilheteria para financiar boas obras internacionais como O Menino e o Mundo, As Boas Maneiras, </w:t>
+        <w:t>, usaram seus resultados de bilheteria para financiar boas obras</w:t>
+      </w:r>
+      <w:r>
+        <w:t xml:space="preserve"> de desempenho</w:t>
+      </w:r>
+      <w:r>
+        <w:t xml:space="preserve"> internacion</w:t>
+      </w:r>
+      <w:r>
+        <w:t>al</w:t>
+      </w:r>
+      <w:r>
+        <w:t xml:space="preserve"> como O Menino e o Mundo, As Boas Maneiras, </w:t>
       </w:r>
       <w:r>
         <w:t>Vazante, Era o Hotel Cambridge e Todos os Mortos. E ainda usaram seus resultados internacionais para selecionar Mato Seco Em Chamas, Regra 34, A Febre, Corpo Elétrico.</w:t>
@@ -765,11 +988,13 @@
     </w:p>
     <w:p>
       <w:r>
-        <w:t xml:space="preserve">Mas realmente quando você analisa o quadro completo o resultado dos editais seletivos, com leitura humana, filtro por bilheteria e distribuidora como proponente tem o resultado mais expressivo e com uma boa distância dos demais. Agora também é verdade </w:t>
-      </w:r>
-      <w:r>
-        <w:lastRenderedPageBreak/>
-        <w:t>que esse módulo recebeu o maior volume de recursos, precisaria de uma investigação mais detalhadas antes de chegar a uma conclusão definitiva.</w:t>
+        <w:t xml:space="preserve">Mas realmente quando você analisa o quadro completo o resultado dos editais seletivos, com leitura humana, filtro por bilheteria e distribuidora como proponente tem o resultado mais expressivo e com uma boa distância dos demais. Agora também é verdade que esse </w:t>
+      </w:r>
+      <w:r>
+        <w:t>modelo</w:t>
+      </w:r>
+      <w:r>
+        <w:t xml:space="preserve"> recebeu o maior volume de recursos, precisaria de uma investigação mais detalhada antes de chegar a uma conclusão definitiva.</w:t>
       </w:r>
     </w:p>
     <w:p/>
@@ -837,7 +1062,29 @@
     </w:p>
     <w:p>
       <w:r>
-        <w:t xml:space="preserve">As chamadas que poderiam ser classificadas de só leitura humana não são ainda objeto de análise por falta de tempo de maturação dos dados de retorno. A atual gestão inaugurou dois novos modelos: um que inverte o filtro automático, permitindo que apenas produtoras de níveis de captação mais baixo participem de uma chamada; e outra realmente de ampla concorrência em que uma primeira fase é avaliada por argumento e </w:t>
+        <w:t xml:space="preserve">As chamadas que poderiam ser classificadas de só leitura humana não são ainda objeto de análise por falta de tempo de maturação dos dados de retorno. </w:t>
+      </w:r>
+      <w:r>
+        <w:t>Nos últimos anos foram testados</w:t>
+      </w:r>
+      <w:r>
+        <w:t xml:space="preserve"> dois novos modelos: um que inverte o filtro automático, permitindo que </w:t>
+      </w:r>
+      <w:r>
+        <w:lastRenderedPageBreak/>
+        <w:t xml:space="preserve">apenas produtoras de </w:t>
+      </w:r>
+      <w:r>
+        <w:t>“</w:t>
+      </w:r>
+      <w:r>
+        <w:t>níveis de captação mais baixo</w:t>
+      </w:r>
+      <w:r>
+        <w:t>”</w:t>
+      </w:r>
+      <w:r>
+        <w:t xml:space="preserve"> participem de uma chamada; e outra realmente de ampla concorrência em que uma primeira fase é avaliada por argumento e </w:t>
       </w:r>
       <w:proofErr w:type="spellStart"/>
       <w:r>
@@ -857,7 +1104,13 @@
         <w:t>o segundo</w:t>
       </w:r>
       <w:r>
-        <w:t>, principalmente porque a minha experiência (e daí 100% de viés na análise) é a de que a qualidade da seleção humana é inversamente proporcional à escala que a ampla concorrência abre. Temos um placebo de olhar qualificado, mas que resulta em algo pouco melhor do que um sorteio em que o match aleatório entre projeto e parecerista é o que irá definir se o projeto avança de fase.</w:t>
+        <w:t>, principalmente porque a minha experiência (e daí 100% de viés na análise) é a de que a qualidade da seleção humana é inversamente proporcional à escala que a ampla concorrência abre. Temos um placebo de olhar qualificado, mas que resulta em algo pouco melhor do que um sorteio</w:t>
+      </w:r>
+      <w:r>
+        <w:t>,</w:t>
+      </w:r>
+      <w:r>
+        <w:t xml:space="preserve"> em que o match aleatório entre projeto e parecerista é o que irá definir se o projeto avança de fase.</w:t>
       </w:r>
     </w:p>
     <w:p>
@@ -900,19 +1153,50 @@
         <w:t xml:space="preserve">Essa ideia da exclusão total da dimensão objetiva em prol de uma suposta “seleção artística” vai de encontro a uma política pública baseada em evidências e, sinceramente, me soa obscurantismo. </w:t>
       </w:r>
       <w:r>
-        <w:t xml:space="preserve">De qualquer forma, precisamos aguardar e avaliar esses editais </w:t>
-      </w:r>
-      <w:r>
-        <w:lastRenderedPageBreak/>
-        <w:t>nos próximos 2–3 anos para ver se eles realmente sucedem em quebrar a barreira de entrada e ao mesmo tempo produzir um resultado relevante.</w:t>
+        <w:t>De qualquer forma, precisamos aguardar e avaliar esses editais nos próximos 2–3 anos para ver se eles realmente sucedem em quebrar a barreira de entrada e ao mesmo tempo produzir um resultado relevante.</w:t>
       </w:r>
     </w:p>
     <w:p>
       <w:r>
-        <w:t xml:space="preserve">E aqui talvez eu abra uma porta de polêmica, mas é necessário pelo menos perguntar. Uma produtora que ainda não produziu e lançou um longa em salas de cinema ou que tenha uma carreira com bons resultados em festivais internacionais ou nacionais ou que ainda não tenha, por exemplo, colocado um curta metragem em festivais internacionais. A linha mais adequada </w:t>
-      </w:r>
-      <w:r>
-        <w:t xml:space="preserve">está </w:t>
+        <w:t>E aqui talvez eu abra uma porta de polêmica, mas é necessário pelo menos perguntar. Uma produtora que ainda não produziu e lançou um longa em salas de cinema ou que tenha uma carreira com bons resultados em festivais internacionais ou nacionais</w:t>
+      </w:r>
+      <w:r>
+        <w:t>.</w:t>
+      </w:r>
+      <w:r>
+        <w:t xml:space="preserve"> </w:t>
+      </w:r>
+      <w:r>
+        <w:t>O</w:t>
+      </w:r>
+      <w:r>
+        <w:t>u que ainda não tenha, por exemplo, colocado um curta metragem em festivais internacionais. A</w:t>
+      </w:r>
+      <w:r>
+        <w:t>s</w:t>
+      </w:r>
+      <w:r>
+        <w:t xml:space="preserve"> </w:t>
+      </w:r>
+      <w:proofErr w:type="gramStart"/>
+      <w:r>
+        <w:t>linha</w:t>
+      </w:r>
+      <w:r>
+        <w:t>s</w:t>
+      </w:r>
+      <w:r>
+        <w:t xml:space="preserve"> mais adequada</w:t>
+      </w:r>
+      <w:proofErr w:type="gramEnd"/>
+      <w:r>
+        <w:t xml:space="preserve"> </w:t>
+      </w:r>
+      <w:r>
+        <w:t>para estas produtoras estão</w:t>
+      </w:r>
+      <w:r>
+        <w:t xml:space="preserve"> </w:t>
       </w:r>
       <w:r>
         <w:t>nas chamadas</w:t>
@@ -948,7 +1232,25 @@
         <w:t>de abrangência</w:t>
       </w:r>
       <w:r>
-        <w:t xml:space="preserve"> Nacional sejam para empresas que já geraram resultados mensuráveis de alguma forma.</w:t>
+        <w:t xml:space="preserve"> </w:t>
+      </w:r>
+      <w:r>
+        <w:t>n</w:t>
+      </w:r>
+      <w:r>
+        <w:t xml:space="preserve">acional sejam para empresas que já geraram </w:t>
+      </w:r>
+      <w:r>
+        <w:t xml:space="preserve">algum </w:t>
+      </w:r>
+      <w:r>
+        <w:t>resultado mensurá</w:t>
+      </w:r>
+      <w:r>
+        <w:t>vel</w:t>
+      </w:r>
+      <w:r>
+        <w:t>.</w:t>
       </w:r>
     </w:p>
     <w:p>
@@ -987,6 +1289,10 @@
     </w:p>
     <w:p>
       <w:r>
+        <w:rPr>
+          <w:noProof/>
+        </w:rPr>
+        <w:lastRenderedPageBreak/>
         <w:drawing>
           <wp:inline distT="0" distB="0" distL="0" distR="0" wp14:anchorId="4C711001" wp14:editId="5DDDC478">
             <wp:extent cx="5486400" cy="2063115"/>
@@ -1078,17 +1384,22 @@
         <w:t>No outro lado do espectro</w:t>
       </w:r>
       <w:r>
-        <w:t xml:space="preserve"> de quem tem desempenho mensurável</w:t>
+        <w:t xml:space="preserve"> </w:t>
+      </w:r>
+      <w:r>
+        <w:t>(</w:t>
+      </w:r>
+      <w:r>
+        <w:t>de quem tem desempenho mensurável</w:t>
+      </w:r>
+      <w:r>
+        <w:t>)</w:t>
       </w:r>
       <w:r>
         <w:t xml:space="preserve"> está o grupo do Retorno Internacional, formado por empresas que ainda não tiveram um resultado expressivo nos cinemas brasileiros, mas conseguiram romper a barreira da exportação com suas obras. São </w:t>
       </w:r>
       <w:r>
-        <w:t xml:space="preserve">52 empresas que receberam menos de 500M, geraram quase nada </w:t>
-      </w:r>
-      <w:r>
-        <w:lastRenderedPageBreak/>
-        <w:t>de renda doméstica, mas foram exportadas para 33 países. A</w:t>
+        <w:t>52 empresas que receberam menos de 500M, geraram quase nada de renda doméstica, mas foram exportadas para 33 países. A</w:t>
       </w:r>
       <w:r>
         <w:t xml:space="preserve"> Cinco da Norte (DF) levou Mato Seco em Chamas a 68 festivais internacionais com ticket total de menos de </w:t>
@@ -1147,15 +1458,13 @@
         <w:t xml:space="preserve">e os mesmos 33 países atingidos. </w:t>
       </w:r>
       <w:r>
-        <w:t xml:space="preserve">Aqui aparecem as empresas maiores que já estavam </w:t>
-      </w:r>
-      <w:proofErr w:type="gramStart"/>
-      <w:r>
-        <w:t>bem posicionadas</w:t>
-      </w:r>
-      <w:proofErr w:type="gramEnd"/>
-      <w:r>
-        <w:t xml:space="preserve"> principalmente na sua capacidade de captação em renúncia fiscal, mas que também acessaram o FSA de forma relevante. Trouxeram resultados em salas e internacionalização fortes, mas são de longe as maiores captadoras: Gullane (SP), Conspiração (RJ), O2 (SP). Tem também um bloco de produtoras mais antigas e </w:t>
+        <w:t xml:space="preserve">Aqui aparecem as empresas maiores que já estavam posicionadas principalmente na sua capacidade de captação em renúncia fiscal, mas que também acessaram o FSA </w:t>
+      </w:r>
+      <w:r>
+        <w:t>desde o início</w:t>
+      </w:r>
+      <w:r>
+        <w:t xml:space="preserve">. Trouxeram resultados em salas e internacionalização fortes, mas são de longe as maiores captadoras: Gullane (SP), Conspiração (RJ), O2 (SP). Tem também um bloco de produtoras mais antigas e </w:t>
       </w:r>
       <w:r>
         <w:t>internacionalização</w:t>
@@ -1185,6 +1494,7 @@
     </w:p>
     <w:p>
       <w:r>
+        <w:lastRenderedPageBreak/>
         <w:t xml:space="preserve">E aqui tenho que concordar também com o outro citado na </w:t>
       </w:r>
       <w:r>
@@ -1271,13 +1581,31 @@
         <w:t>s</w:t>
       </w:r>
       <w:r>
-        <w:t xml:space="preserve"> para a engrenagem das produtoras consigam chegar a uma segunda ou terceira marcha. As únicas que chegaram na terceira e talvez quarta marcha são </w:t>
+        <w:t xml:space="preserve"> para </w:t>
+      </w:r>
+      <w:r>
+        <w:t xml:space="preserve">que </w:t>
+      </w:r>
+      <w:r>
+        <w:t>a engrenagem das produtoras consiga</w:t>
+      </w:r>
+      <w:r>
+        <w:t xml:space="preserve"> chegar a uma segunda ou terceira marcha. As únicas que chegaram na terceira e talvez quarta marcha são </w:t>
       </w:r>
       <w:r>
         <w:t>justamente as mais antigas</w:t>
       </w:r>
       <w:r>
-        <w:t>, outro dado revelador</w:t>
+        <w:t>.</w:t>
+      </w:r>
+      <w:r>
+        <w:t xml:space="preserve"> </w:t>
+      </w:r>
+      <w:r>
+        <w:t>O</w:t>
+      </w:r>
+      <w:r>
+        <w:t>utro dado revelador</w:t>
       </w:r>
       <w:r>
         <w:t>:</w:t>
@@ -1300,19 +1628,45 @@
     </w:p>
     <w:p>
       <w:r>
-        <w:lastRenderedPageBreak/>
-        <w:t xml:space="preserve">E não temos como ignorar os outros dois clusters, baixo retorno e pequeno porte. </w:t>
+        <w:t>E não temos como ignorar os outros dois clusters</w:t>
+      </w:r>
+      <w:r>
+        <w:t>:</w:t>
+      </w:r>
+      <w:r>
+        <w:t xml:space="preserve"> baixo retorno e pequeno porte. </w:t>
       </w:r>
       <w:r>
         <w:t xml:space="preserve">São pouco mais de mil empresas que receberam 2B de FSA e 2,5B de renúncia e geraram 550M de renda estimada e presença internacional bem tímida. Ou seja, produziram os filmes que não geraram retorno </w:t>
+      </w:r>
+      <w:r>
+        <w:t>relevante.</w:t>
       </w:r>
     </w:p>
     <w:p>
       <w:r>
-        <w:t xml:space="preserve">Mas para entender melhor é necessário separar os dois grupos. No primeiro são 174 empresas que receberam mais de 5M em investimento. Esse é um grupo que entenderia como um resultado esperado. </w:t>
-      </w:r>
-      <w:r>
-        <w:t>Faz parte do modelo de negócio do audiovisual em qualquer lugar e época conhecida em que essa balança é sempre assim, ou seja, o mercado é “carregado” por um número desproporcional de filmes e, logo, empresas. É esperado que tenha uma grande franja de obras que não performam até que surjam sucessos que compensam o todo.</w:t>
+        <w:t>Mas para entender melhor é necessário separar os dois grupos. No primeiro são 174 empresas que receberam mais de 5M em investimento. Esse é um grupo que entenderia como um resultado esperado. Faz parte do modelo de negócio do audiovisual</w:t>
+      </w:r>
+      <w:r>
+        <w:t>,</w:t>
+      </w:r>
+      <w:r>
+        <w:t xml:space="preserve"> em qualquer lugar e época conhecida</w:t>
+      </w:r>
+      <w:r>
+        <w:t>,</w:t>
+      </w:r>
+      <w:r>
+        <w:t xml:space="preserve"> em que essa balança é sempre assim, ou seja, o mercado é “carregado” por um número desproporcional</w:t>
+      </w:r>
+      <w:r>
+        <w:t>mente pequeno</w:t>
+      </w:r>
+      <w:r>
+        <w:t xml:space="preserve"> </w:t>
+      </w:r>
+      <w:r>
+        <w:t>de filmes e, logo, empresas. É esperado que tenha uma grande franja de obras que não performam até que surjam sucessos que compensam o todo.</w:t>
       </w:r>
     </w:p>
     <w:p>
@@ -1341,7 +1695,11 @@
       </w:r>
       <w:proofErr w:type="gramEnd"/>
       <w:r>
-        <w:t xml:space="preserve"> do setor investiram em filmes sem resultado verificável. É sim questionável do ponto de vista da regulação do fomento se esse é um resultado que faz sentido para o Brasil. Repito, nós perdemos a capacidade de alocar melhor esse recurso e mantemos o altíssimo custo burocrático dessa gestão, tanto no fomento, quanto na prestação de contas. Não me parece que esse desenho atenda plenamente o interesse nacional.</w:t>
+        <w:t xml:space="preserve"> do setor investiram em filmes sem resultado verificável. É sim questionável do ponto de vista da regulação do fomento se esse é um resultado que faz sentido para o Brasil. Repito, nós perdemos a capacidade </w:t>
+      </w:r>
+      <w:r>
+        <w:lastRenderedPageBreak/>
+        <w:t>de alocar melhor esse recurso e mantemos o altíssimo custo burocrático dessa gestão, tanto no fomento, quanto na prestação de contas. Não me parece que esse desenho atenda plenamente o interesse nacional.</w:t>
       </w:r>
     </w:p>
     <w:p>
@@ -1539,11 +1897,7 @@
         <w:t xml:space="preserve"> as distribuidoras </w:t>
       </w:r>
       <w:r>
-        <w:t xml:space="preserve">ficam </w:t>
-      </w:r>
-      <w:r>
-        <w:lastRenderedPageBreak/>
-        <w:t xml:space="preserve">com </w:t>
+        <w:t xml:space="preserve">ficam com </w:t>
       </w:r>
       <w:r>
         <w:t>uma comissão sobre a renda e ainda podem abater seus custos fixos como P&amp;A com retenção prioritária</w:t>
@@ -1654,6 +2008,7 @@
         <w:jc w:val="both"/>
       </w:pPr>
       <w:r>
+        <w:lastRenderedPageBreak/>
         <w:t xml:space="preserve">Estamos investindo via produtora, esse recurso percorre toda a cadeia para cima e para baixo, o fundo pega um pedacinho da última etapa e estamos procurando “lucro” ali, querendo comparar com o quanto foi investido na produção. </w:t>
       </w:r>
       <w:r>
@@ -1701,11 +2056,7 @@
         <w:t>reinvestir nas empresas nacionais</w:t>
       </w:r>
       <w:r>
-        <w:t xml:space="preserve">. O FSA foi desenhado para manter a roda girando, quem tem que lucrar são as empresas e não o fundo. Avaliar através da recuperação financeira coletada na última etapa de uma cadeia complexa e desigual é ficar cego em um cenário de fluxos de capitais financeiros e imateriais gigantescos e globais. Esse é jogo que o FSA está jogando e </w:t>
-      </w:r>
-      <w:r>
-        <w:lastRenderedPageBreak/>
-        <w:t>nunca o de se uma obra específica retornou mais ou menos em salas de exibição só no Brasil.</w:t>
+        <w:t>. O FSA foi desenhado para manter a roda girando, quem tem que lucrar são as empresas e não o fundo. Avaliar através da recuperação financeira coletada na última etapa de uma cadeia complexa e desigual é ficar cego em um cenário de fluxos de capitais financeiros e imateriais gigantescos e globais. Esse é jogo que o FSA está jogando e nunca o de se uma obra específica retornou mais ou menos em salas de exibição só no Brasil.</w:t>
       </w:r>
     </w:p>
     <w:p>
@@ -1797,6 +2148,7 @@
     </w:p>
     <w:p>
       <w:r>
+        <w:lastRenderedPageBreak/>
         <w:t>Junto com essa centralidade da produtora, o fomento público foi criando regras contra a concentração</w:t>
       </w:r>
       <w:r>
@@ -1820,6 +2172,9 @@
     </w:p>
     <w:p>
       <w:r>
+        <w:rPr>
+          <w:noProof/>
+        </w:rPr>
         <w:drawing>
           <wp:inline distT="0" distB="0" distL="0" distR="0" wp14:anchorId="3CF49AF2" wp14:editId="64CF039D">
             <wp:extent cx="5486400" cy="1828800"/>
@@ -1864,7 +2219,6 @@
     </w:p>
     <w:p>
       <w:r>
-        <w:lastRenderedPageBreak/>
         <w:t xml:space="preserve">É importante não cair na armadilha de pensar que porque a pulverização é um problema, a concentração não é. </w:t>
       </w:r>
       <w:r>
@@ -1885,6 +2239,7 @@
         <w:rPr>
           <w:noProof/>
         </w:rPr>
+        <w:lastRenderedPageBreak/>
         <w:drawing>
           <wp:inline distT="0" distB="0" distL="0" distR="0" wp14:anchorId="1203EB69" wp14:editId="3B6ADD0C">
             <wp:extent cx="3275965" cy="2794857"/>
@@ -1990,7 +2345,6 @@
     </w:p>
     <w:p>
       <w:r>
-        <w:lastRenderedPageBreak/>
         <w:t xml:space="preserve">O fomento público tem uma capacidade de carga. </w:t>
       </w:r>
       <w:r>
@@ -2026,6 +2380,7 @@
         <w:rPr>
           <w:noProof/>
         </w:rPr>
+        <w:lastRenderedPageBreak/>
         <w:drawing>
           <wp:inline distT="0" distB="0" distL="0" distR="0" wp14:anchorId="61F943EC" wp14:editId="0434975D">
             <wp:extent cx="5530215" cy="3698543"/>
@@ -2149,11 +2504,7 @@
         <w:t>400</w:t>
       </w:r>
       <w:r>
-        <w:t xml:space="preserve"> mil antes de produzir um único frame. Com ciclos de produção de 18 a 24 </w:t>
-      </w:r>
-      <w:r>
-        <w:lastRenderedPageBreak/>
-        <w:t xml:space="preserve">meses por longa-metragem, um ticket </w:t>
+        <w:t xml:space="preserve"> mil antes de produzir um único frame. Com ciclos de produção de 18 a 24 meses por longa-metragem, um ticket </w:t>
       </w:r>
       <w:r>
         <w:t>anual abaixo</w:t>
@@ -2269,7 +2620,6 @@
     </w:p>
     <w:p>
       <w:r>
-        <w:lastRenderedPageBreak/>
         <w:t xml:space="preserve">O que mais me chama atenção no modelo do BFI (British </w:t>
       </w:r>
       <w:proofErr w:type="spellStart"/>
@@ -2310,6 +2660,7 @@
         </w:numPr>
       </w:pPr>
       <w:r>
+        <w:lastRenderedPageBreak/>
         <w:t xml:space="preserve">Standard B (Equipe Técnica): Pelo menos 3 chefes de departamento de grupos </w:t>
       </w:r>
       <w:proofErr w:type="spellStart"/>
@@ -2405,13 +2756,16 @@
     </w:p>
     <w:p>
       <w:r>
-        <w:lastRenderedPageBreak/>
         <w:t xml:space="preserve">A única divergência que vou abrir em relação aos citados na epígrafe é com a Ana Paula Sousa, uma das melhores articulistas sobre política audiovisual que temos, mas que falha totalmente neste diagnóstico específico. </w:t>
       </w:r>
     </w:p>
     <w:p>
       <w:r>
-        <w:t xml:space="preserve">Não tem sombra de corporativismo quando digo: a Ancine hoje é uma máquina de eficiência para rodar o FSA e os mecanismos de renúncia. A quantidade de contratos, a imensa variedade de composições de mecanismos de financiamento, conflitos entre normativos, atendimento dos órgãos de controle. A Ancine hoje tem a capacidade de operar 1B por ano com ticket médio baixo e com grau de complexidade alto. Não é verdade que os servidores mudam de função com uma frequência que traga algum impacto. Se o problema é a instabilidade você pode ter certeza </w:t>
+        <w:t xml:space="preserve">Não tem sombra de corporativismo quando digo: a Ancine hoje é uma máquina de eficiência para rodar o FSA e os mecanismos de renúncia. A quantidade de contratos, a imensa variedade de composições de mecanismos de financiamento, conflitos entre </w:t>
+      </w:r>
+      <w:r>
+        <w:lastRenderedPageBreak/>
+        <w:t xml:space="preserve">normativos, atendimento dos órgãos de controle. A Ancine hoje tem a capacidade de operar 1B por ano com ticket médio baixo e com grau de complexidade alto. Não é verdade que os servidores mudam de função com uma frequência que traga algum impacto. Se o problema é a instabilidade você pode ter certeza </w:t>
       </w:r>
       <w:proofErr w:type="gramStart"/>
       <w:r>
@@ -2545,11 +2899,7 @@
         <w:t xml:space="preserve"> para atender o decreto). </w:t>
       </w:r>
       <w:r>
-        <w:t xml:space="preserve">A transparência deveria vir justamente do CSC e CGFSA dizerem qual é a estratégia de investimento a longo prazo. Planos de 5, 10 anos que ultrapassem governos. E se o plano não for possível por </w:t>
-      </w:r>
-      <w:r>
-        <w:lastRenderedPageBreak/>
-        <w:t>contingenciamento que se registre e o CGFSA determina onde vai cortar.</w:t>
+        <w:t>A transparência deveria vir justamente do CSC e CGFSA dizerem qual é a estratégia de investimento a longo prazo. Planos de 5, 10 anos que ultrapassem governos. E se o plano não for possível por contingenciamento que se registre e o CGFSA determina onde vai cortar.</w:t>
       </w:r>
       <w:r>
         <w:t xml:space="preserve"> Agora ter </w:t>
@@ -2584,6 +2934,7 @@
         </w:numPr>
       </w:pPr>
       <w:r>
+        <w:lastRenderedPageBreak/>
         <w:t xml:space="preserve">Conflito de Interesses – Não me interessa a fulanização, mas é comum que experts do setor tenham cadeira no CGFSA que determina as regras dos editais e depois as suas empresas participam dos editais que elas aprovaram. Todas as informações necessárias para se cruzar essa informação são públicas. Só pegar a lista de todos os que já participaram do Comite aqui </w:t>
       </w:r>
       <w:hyperlink r:id="rId14" w:history="1">
@@ -2776,46 +3127,49 @@
     </w:p>
     <w:p>
       <w:r>
+        <w:t xml:space="preserve">A única questão é que os dados mostram </w:t>
+      </w:r>
+      <w:r>
+        <w:t>que o interesse público não</w:t>
+      </w:r>
+      <w:r>
+        <w:t xml:space="preserve"> </w:t>
+      </w:r>
+      <w:r>
+        <w:t>permite que se</w:t>
+      </w:r>
+      <w:r>
+        <w:t xml:space="preserve"> </w:t>
+      </w:r>
+      <w:proofErr w:type="gramStart"/>
+      <w:r>
+        <w:t>abr</w:t>
+      </w:r>
+      <w:r>
+        <w:t>a</w:t>
+      </w:r>
+      <w:r>
+        <w:t xml:space="preserve"> mão da</w:t>
+      </w:r>
+      <w:proofErr w:type="gramEnd"/>
+      <w:r>
+        <w:t xml:space="preserve"> avaliação externa nem nos casos de empresas já consagradas. A carteira apresentada passa por uma avaliação de comitê aonde todas as SPEs competem tanto pelos seus desempenhos pretéritos, como </w:t>
+      </w:r>
+      <w:r>
+        <w:t>pel</w:t>
+      </w:r>
+      <w:r>
+        <w:t>a</w:t>
+      </w:r>
+      <w:r>
+        <w:t>s</w:t>
+      </w:r>
+      <w:r>
+        <w:t xml:space="preserve"> suas propostas de carteira. O Comitê de Investimento tem nas mãos o que deve ser, em tese, os melhores projetos das empresas </w:t>
+      </w:r>
+      <w:r>
         <w:lastRenderedPageBreak/>
-        <w:t xml:space="preserve">A única questão é que os dados mostram </w:t>
-      </w:r>
-      <w:r>
-        <w:t>que o interesse público não</w:t>
-      </w:r>
-      <w:r>
-        <w:t xml:space="preserve"> </w:t>
-      </w:r>
-      <w:r>
-        <w:t>permite que se</w:t>
-      </w:r>
-      <w:r>
-        <w:t xml:space="preserve"> </w:t>
-      </w:r>
-      <w:proofErr w:type="gramStart"/>
-      <w:r>
-        <w:t>abr</w:t>
-      </w:r>
-      <w:r>
-        <w:t>a</w:t>
-      </w:r>
-      <w:r>
-        <w:t xml:space="preserve"> mão da</w:t>
-      </w:r>
-      <w:proofErr w:type="gramEnd"/>
-      <w:r>
-        <w:t xml:space="preserve"> avaliação externa nem nos casos de empresas já consagradas. A carteira apresentada passa por uma avaliação de comitê aonde todas as SPEs competem tanto pelos seus desempenhos pretéritos, como </w:t>
-      </w:r>
-      <w:r>
-        <w:t>pel</w:t>
-      </w:r>
-      <w:r>
-        <w:t>a</w:t>
-      </w:r>
-      <w:r>
-        <w:t>s</w:t>
-      </w:r>
-      <w:r>
-        <w:t xml:space="preserve"> suas propostas de carteira. O Comitê de Investimento tem nas mãos o que deve ser, em tese, os melhores projetos das empresas de melhor desempenho dos últimos anos e elege entre elas as melhores propostas de cada uma</w:t>
+        <w:t>de melhor desempenho dos últimos anos e elege entre elas as melhores propostas de cada uma</w:t>
       </w:r>
       <w:r>
         <w:t xml:space="preserve"> ou as que melhor preencham os propósitos mais republicanos da política audiovisual brasileira</w:t>
@@ -2931,11 +3285,7 @@
       </w:r>
       <w:proofErr w:type="spellEnd"/>
       <w:r>
-        <w:t xml:space="preserve"> Muritiba, Anitta Rocha, André Novais, Gabriel </w:t>
-      </w:r>
-      <w:r>
-        <w:lastRenderedPageBreak/>
-        <w:t>Martins</w:t>
+        <w:t xml:space="preserve"> Muritiba, Anitta Rocha, André Novais, Gabriel Martins</w:t>
       </w:r>
       <w:r>
         <w:t xml:space="preserve">. Não importa a referência, seja entre os selecionados em longas de forma geral, seja entre os 400 curtas produzidos por ano, </w:t>
@@ -2949,7 +3299,11 @@
     </w:p>
     <w:p>
       <w:r>
-        <w:t>Uma forma de quebrar a barreira de entrada e aproveitar uma seleção em um grande festival que tem mais chance de emplacar uma seleção em longas é abrindo um SUAT que mede o desempenho de curtas e acelera o primeiro longa de uma nova geração que já rompeu uma primeira e difícil barreira no mercado internacional e nacional.</w:t>
+        <w:t xml:space="preserve">Uma forma de quebrar a barreira de entrada e aproveitar uma seleção em um grande festival que tem mais chance de emplacar uma seleção em longas é abrindo um SUAT </w:t>
+      </w:r>
+      <w:r>
+        <w:lastRenderedPageBreak/>
+        <w:t>que mede o desempenho de curtas e acelera o primeiro longa de uma nova geração que já rompeu uma primeira e difícil barreira no mercado internacional e nacional.</w:t>
       </w:r>
     </w:p>
     <w:p>
@@ -3120,7 +3474,6 @@
     </w:p>
     <w:p>
       <w:r>
-        <w:lastRenderedPageBreak/>
         <w:t>Uma distribuição possível:</w:t>
       </w:r>
     </w:p>
@@ -3184,6 +3537,7 @@
         </w:numPr>
       </w:pPr>
       <w:r>
+        <w:lastRenderedPageBreak/>
         <w:t>Ampla concorrência 50M</w:t>
       </w:r>
     </w:p>
@@ -3478,6 +3832,119 @@
     </w:lvl>
   </w:abstractNum>
   <w:abstractNum w:abstractNumId="10" w15:restartNumberingAfterBreak="0">
+    <w:nsid w:val="0EA33C9A"/>
+    <w:multiLevelType w:val="hybridMultilevel"/>
+    <w:tmpl w:val="3F286EE2"/>
+    <w:lvl w:ilvl="0" w:tplc="04160001">
+      <w:start w:val="1"/>
+      <w:numFmt w:val="bullet"/>
+      <w:lvlText w:val=""/>
+      <w:lvlJc w:val="left"/>
+      <w:pPr>
+        <w:ind w:left="720" w:hanging="360"/>
+      </w:pPr>
+      <w:rPr>
+        <w:rFonts w:ascii="Symbol" w:hAnsi="Symbol" w:hint="default"/>
+      </w:rPr>
+    </w:lvl>
+    <w:lvl w:ilvl="1" w:tplc="04160003" w:tentative="1">
+      <w:start w:val="1"/>
+      <w:numFmt w:val="bullet"/>
+      <w:lvlText w:val="o"/>
+      <w:lvlJc w:val="left"/>
+      <w:pPr>
+        <w:ind w:left="1440" w:hanging="360"/>
+      </w:pPr>
+      <w:rPr>
+        <w:rFonts w:ascii="Courier New" w:hAnsi="Courier New" w:cs="Courier New" w:hint="default"/>
+      </w:rPr>
+    </w:lvl>
+    <w:lvl w:ilvl="2" w:tplc="04160005" w:tentative="1">
+      <w:start w:val="1"/>
+      <w:numFmt w:val="bullet"/>
+      <w:lvlText w:val=""/>
+      <w:lvlJc w:val="left"/>
+      <w:pPr>
+        <w:ind w:left="2160" w:hanging="360"/>
+      </w:pPr>
+      <w:rPr>
+        <w:rFonts w:ascii="Wingdings" w:hAnsi="Wingdings" w:hint="default"/>
+      </w:rPr>
+    </w:lvl>
+    <w:lvl w:ilvl="3" w:tplc="04160001" w:tentative="1">
+      <w:start w:val="1"/>
+      <w:numFmt w:val="bullet"/>
+      <w:lvlText w:val=""/>
+      <w:lvlJc w:val="left"/>
+      <w:pPr>
+        <w:ind w:left="2880" w:hanging="360"/>
+      </w:pPr>
+      <w:rPr>
+        <w:rFonts w:ascii="Symbol" w:hAnsi="Symbol" w:hint="default"/>
+      </w:rPr>
+    </w:lvl>
+    <w:lvl w:ilvl="4" w:tplc="04160003" w:tentative="1">
+      <w:start w:val="1"/>
+      <w:numFmt w:val="bullet"/>
+      <w:lvlText w:val="o"/>
+      <w:lvlJc w:val="left"/>
+      <w:pPr>
+        <w:ind w:left="3600" w:hanging="360"/>
+      </w:pPr>
+      <w:rPr>
+        <w:rFonts w:ascii="Courier New" w:hAnsi="Courier New" w:cs="Courier New" w:hint="default"/>
+      </w:rPr>
+    </w:lvl>
+    <w:lvl w:ilvl="5" w:tplc="04160005" w:tentative="1">
+      <w:start w:val="1"/>
+      <w:numFmt w:val="bullet"/>
+      <w:lvlText w:val=""/>
+      <w:lvlJc w:val="left"/>
+      <w:pPr>
+        <w:ind w:left="4320" w:hanging="360"/>
+      </w:pPr>
+      <w:rPr>
+        <w:rFonts w:ascii="Wingdings" w:hAnsi="Wingdings" w:hint="default"/>
+      </w:rPr>
+    </w:lvl>
+    <w:lvl w:ilvl="6" w:tplc="04160001" w:tentative="1">
+      <w:start w:val="1"/>
+      <w:numFmt w:val="bullet"/>
+      <w:lvlText w:val=""/>
+      <w:lvlJc w:val="left"/>
+      <w:pPr>
+        <w:ind w:left="5040" w:hanging="360"/>
+      </w:pPr>
+      <w:rPr>
+        <w:rFonts w:ascii="Symbol" w:hAnsi="Symbol" w:hint="default"/>
+      </w:rPr>
+    </w:lvl>
+    <w:lvl w:ilvl="7" w:tplc="04160003" w:tentative="1">
+      <w:start w:val="1"/>
+      <w:numFmt w:val="bullet"/>
+      <w:lvlText w:val="o"/>
+      <w:lvlJc w:val="left"/>
+      <w:pPr>
+        <w:ind w:left="5760" w:hanging="360"/>
+      </w:pPr>
+      <w:rPr>
+        <w:rFonts w:ascii="Courier New" w:hAnsi="Courier New" w:cs="Courier New" w:hint="default"/>
+      </w:rPr>
+    </w:lvl>
+    <w:lvl w:ilvl="8" w:tplc="04160005" w:tentative="1">
+      <w:start w:val="1"/>
+      <w:numFmt w:val="bullet"/>
+      <w:lvlText w:val=""/>
+      <w:lvlJc w:val="left"/>
+      <w:pPr>
+        <w:ind w:left="6480" w:hanging="360"/>
+      </w:pPr>
+      <w:rPr>
+        <w:rFonts w:ascii="Wingdings" w:hAnsi="Wingdings" w:hint="default"/>
+      </w:rPr>
+    </w:lvl>
+  </w:abstractNum>
+  <w:abstractNum w:abstractNumId="11" w15:restartNumberingAfterBreak="0">
     <w:nsid w:val="233431A5"/>
     <w:multiLevelType w:val="hybridMultilevel"/>
     <w:tmpl w:val="6428B7BA"/>
@@ -3590,7 +4057,7 @@
       </w:rPr>
     </w:lvl>
   </w:abstractNum>
-  <w:abstractNum w:abstractNumId="11" w15:restartNumberingAfterBreak="0">
+  <w:abstractNum w:abstractNumId="12" w15:restartNumberingAfterBreak="0">
     <w:nsid w:val="2ACB7741"/>
     <w:multiLevelType w:val="hybridMultilevel"/>
     <w:tmpl w:val="E21C0256"/>
@@ -3679,7 +4146,7 @@
       </w:pPr>
     </w:lvl>
   </w:abstractNum>
-  <w:abstractNum w:abstractNumId="12" w15:restartNumberingAfterBreak="0">
+  <w:abstractNum w:abstractNumId="13" w15:restartNumberingAfterBreak="0">
     <w:nsid w:val="376D00C1"/>
     <w:multiLevelType w:val="hybridMultilevel"/>
     <w:tmpl w:val="922407C2"/>
@@ -3768,7 +4235,7 @@
       </w:pPr>
     </w:lvl>
   </w:abstractNum>
-  <w:abstractNum w:abstractNumId="13" w15:restartNumberingAfterBreak="0">
+  <w:abstractNum w:abstractNumId="14" w15:restartNumberingAfterBreak="0">
     <w:nsid w:val="3AE94F9F"/>
     <w:multiLevelType w:val="hybridMultilevel"/>
     <w:tmpl w:val="BC4AEB54"/>
@@ -3881,7 +4348,209 @@
       </w:rPr>
     </w:lvl>
   </w:abstractNum>
-  <w:abstractNum w:abstractNumId="14" w15:restartNumberingAfterBreak="0">
+  <w:abstractNum w:abstractNumId="15" w15:restartNumberingAfterBreak="0">
+    <w:nsid w:val="5FF21969"/>
+    <w:multiLevelType w:val="hybridMultilevel"/>
+    <w:tmpl w:val="51D0EE52"/>
+    <w:lvl w:ilvl="0" w:tplc="0416000F">
+      <w:start w:val="1"/>
+      <w:numFmt w:val="decimal"/>
+      <w:lvlText w:val="%1."/>
+      <w:lvlJc w:val="left"/>
+      <w:pPr>
+        <w:ind w:left="720" w:hanging="360"/>
+      </w:pPr>
+      <w:rPr>
+        <w:rFonts w:hint="default"/>
+      </w:rPr>
+    </w:lvl>
+    <w:lvl w:ilvl="1" w:tplc="04160019" w:tentative="1">
+      <w:start w:val="1"/>
+      <w:numFmt w:val="lowerLetter"/>
+      <w:lvlText w:val="%2."/>
+      <w:lvlJc w:val="left"/>
+      <w:pPr>
+        <w:ind w:left="1440" w:hanging="360"/>
+      </w:pPr>
+    </w:lvl>
+    <w:lvl w:ilvl="2" w:tplc="0416001B" w:tentative="1">
+      <w:start w:val="1"/>
+      <w:numFmt w:val="lowerRoman"/>
+      <w:lvlText w:val="%3."/>
+      <w:lvlJc w:val="right"/>
+      <w:pPr>
+        <w:ind w:left="2160" w:hanging="180"/>
+      </w:pPr>
+    </w:lvl>
+    <w:lvl w:ilvl="3" w:tplc="0416000F" w:tentative="1">
+      <w:start w:val="1"/>
+      <w:numFmt w:val="decimal"/>
+      <w:lvlText w:val="%4."/>
+      <w:lvlJc w:val="left"/>
+      <w:pPr>
+        <w:ind w:left="2880" w:hanging="360"/>
+      </w:pPr>
+    </w:lvl>
+    <w:lvl w:ilvl="4" w:tplc="04160019" w:tentative="1">
+      <w:start w:val="1"/>
+      <w:numFmt w:val="lowerLetter"/>
+      <w:lvlText w:val="%5."/>
+      <w:lvlJc w:val="left"/>
+      <w:pPr>
+        <w:ind w:left="3600" w:hanging="360"/>
+      </w:pPr>
+    </w:lvl>
+    <w:lvl w:ilvl="5" w:tplc="0416001B" w:tentative="1">
+      <w:start w:val="1"/>
+      <w:numFmt w:val="lowerRoman"/>
+      <w:lvlText w:val="%6."/>
+      <w:lvlJc w:val="right"/>
+      <w:pPr>
+        <w:ind w:left="4320" w:hanging="180"/>
+      </w:pPr>
+    </w:lvl>
+    <w:lvl w:ilvl="6" w:tplc="0416000F" w:tentative="1">
+      <w:start w:val="1"/>
+      <w:numFmt w:val="decimal"/>
+      <w:lvlText w:val="%7."/>
+      <w:lvlJc w:val="left"/>
+      <w:pPr>
+        <w:ind w:left="5040" w:hanging="360"/>
+      </w:pPr>
+    </w:lvl>
+    <w:lvl w:ilvl="7" w:tplc="04160019" w:tentative="1">
+      <w:start w:val="1"/>
+      <w:numFmt w:val="lowerLetter"/>
+      <w:lvlText w:val="%8."/>
+      <w:lvlJc w:val="left"/>
+      <w:pPr>
+        <w:ind w:left="5760" w:hanging="360"/>
+      </w:pPr>
+    </w:lvl>
+    <w:lvl w:ilvl="8" w:tplc="0416001B" w:tentative="1">
+      <w:start w:val="1"/>
+      <w:numFmt w:val="lowerRoman"/>
+      <w:lvlText w:val="%9."/>
+      <w:lvlJc w:val="right"/>
+      <w:pPr>
+        <w:ind w:left="6480" w:hanging="180"/>
+      </w:pPr>
+    </w:lvl>
+  </w:abstractNum>
+  <w:abstractNum w:abstractNumId="16" w15:restartNumberingAfterBreak="0">
+    <w:nsid w:val="61926887"/>
+    <w:multiLevelType w:val="hybridMultilevel"/>
+    <w:tmpl w:val="990AA3DE"/>
+    <w:lvl w:ilvl="0" w:tplc="04160001">
+      <w:start w:val="1"/>
+      <w:numFmt w:val="bullet"/>
+      <w:lvlText w:val=""/>
+      <w:lvlJc w:val="left"/>
+      <w:pPr>
+        <w:ind w:left="720" w:hanging="360"/>
+      </w:pPr>
+      <w:rPr>
+        <w:rFonts w:ascii="Symbol" w:hAnsi="Symbol" w:hint="default"/>
+      </w:rPr>
+    </w:lvl>
+    <w:lvl w:ilvl="1" w:tplc="04160003" w:tentative="1">
+      <w:start w:val="1"/>
+      <w:numFmt w:val="bullet"/>
+      <w:lvlText w:val="o"/>
+      <w:lvlJc w:val="left"/>
+      <w:pPr>
+        <w:ind w:left="1440" w:hanging="360"/>
+      </w:pPr>
+      <w:rPr>
+        <w:rFonts w:ascii="Courier New" w:hAnsi="Courier New" w:cs="Courier New" w:hint="default"/>
+      </w:rPr>
+    </w:lvl>
+    <w:lvl w:ilvl="2" w:tplc="04160005" w:tentative="1">
+      <w:start w:val="1"/>
+      <w:numFmt w:val="bullet"/>
+      <w:lvlText w:val=""/>
+      <w:lvlJc w:val="left"/>
+      <w:pPr>
+        <w:ind w:left="2160" w:hanging="360"/>
+      </w:pPr>
+      <w:rPr>
+        <w:rFonts w:ascii="Wingdings" w:hAnsi="Wingdings" w:hint="default"/>
+      </w:rPr>
+    </w:lvl>
+    <w:lvl w:ilvl="3" w:tplc="04160001" w:tentative="1">
+      <w:start w:val="1"/>
+      <w:numFmt w:val="bullet"/>
+      <w:lvlText w:val=""/>
+      <w:lvlJc w:val="left"/>
+      <w:pPr>
+        <w:ind w:left="2880" w:hanging="360"/>
+      </w:pPr>
+      <w:rPr>
+        <w:rFonts w:ascii="Symbol" w:hAnsi="Symbol" w:hint="default"/>
+      </w:rPr>
+    </w:lvl>
+    <w:lvl w:ilvl="4" w:tplc="04160003" w:tentative="1">
+      <w:start w:val="1"/>
+      <w:numFmt w:val="bullet"/>
+      <w:lvlText w:val="o"/>
+      <w:lvlJc w:val="left"/>
+      <w:pPr>
+        <w:ind w:left="3600" w:hanging="360"/>
+      </w:pPr>
+      <w:rPr>
+        <w:rFonts w:ascii="Courier New" w:hAnsi="Courier New" w:cs="Courier New" w:hint="default"/>
+      </w:rPr>
+    </w:lvl>
+    <w:lvl w:ilvl="5" w:tplc="04160005" w:tentative="1">
+      <w:start w:val="1"/>
+      <w:numFmt w:val="bullet"/>
+      <w:lvlText w:val=""/>
+      <w:lvlJc w:val="left"/>
+      <w:pPr>
+        <w:ind w:left="4320" w:hanging="360"/>
+      </w:pPr>
+      <w:rPr>
+        <w:rFonts w:ascii="Wingdings" w:hAnsi="Wingdings" w:hint="default"/>
+      </w:rPr>
+    </w:lvl>
+    <w:lvl w:ilvl="6" w:tplc="04160001" w:tentative="1">
+      <w:start w:val="1"/>
+      <w:numFmt w:val="bullet"/>
+      <w:lvlText w:val=""/>
+      <w:lvlJc w:val="left"/>
+      <w:pPr>
+        <w:ind w:left="5040" w:hanging="360"/>
+      </w:pPr>
+      <w:rPr>
+        <w:rFonts w:ascii="Symbol" w:hAnsi="Symbol" w:hint="default"/>
+      </w:rPr>
+    </w:lvl>
+    <w:lvl w:ilvl="7" w:tplc="04160003" w:tentative="1">
+      <w:start w:val="1"/>
+      <w:numFmt w:val="bullet"/>
+      <w:lvlText w:val="o"/>
+      <w:lvlJc w:val="left"/>
+      <w:pPr>
+        <w:ind w:left="5760" w:hanging="360"/>
+      </w:pPr>
+      <w:rPr>
+        <w:rFonts w:ascii="Courier New" w:hAnsi="Courier New" w:cs="Courier New" w:hint="default"/>
+      </w:rPr>
+    </w:lvl>
+    <w:lvl w:ilvl="8" w:tplc="04160005" w:tentative="1">
+      <w:start w:val="1"/>
+      <w:numFmt w:val="bullet"/>
+      <w:lvlText w:val=""/>
+      <w:lvlJc w:val="left"/>
+      <w:pPr>
+        <w:ind w:left="6480" w:hanging="360"/>
+      </w:pPr>
+      <w:rPr>
+        <w:rFonts w:ascii="Wingdings" w:hAnsi="Wingdings" w:hint="default"/>
+      </w:rPr>
+    </w:lvl>
+  </w:abstractNum>
+  <w:abstractNum w:abstractNumId="17" w15:restartNumberingAfterBreak="0">
     <w:nsid w:val="66231565"/>
     <w:multiLevelType w:val="hybridMultilevel"/>
     <w:tmpl w:val="F00C7C2C"/>
@@ -3970,7 +4639,7 @@
       </w:pPr>
     </w:lvl>
   </w:abstractNum>
-  <w:abstractNum w:abstractNumId="15" w15:restartNumberingAfterBreak="0">
+  <w:abstractNum w:abstractNumId="18" w15:restartNumberingAfterBreak="0">
     <w:nsid w:val="6F8C27F0"/>
     <w:multiLevelType w:val="hybridMultilevel"/>
     <w:tmpl w:val="B6A8C06A"/>
@@ -4083,7 +4752,7 @@
       </w:rPr>
     </w:lvl>
   </w:abstractNum>
-  <w:abstractNum w:abstractNumId="16" w15:restartNumberingAfterBreak="0">
+  <w:abstractNum w:abstractNumId="19" w15:restartNumberingAfterBreak="0">
     <w:nsid w:val="749F3657"/>
     <w:multiLevelType w:val="hybridMultilevel"/>
     <w:tmpl w:val="BDE8FC90"/>
@@ -4196,7 +4865,7 @@
       </w:rPr>
     </w:lvl>
   </w:abstractNum>
-  <w:abstractNum w:abstractNumId="17" w15:restartNumberingAfterBreak="0">
+  <w:abstractNum w:abstractNumId="20" w15:restartNumberingAfterBreak="0">
     <w:nsid w:val="788555FF"/>
     <w:multiLevelType w:val="hybridMultilevel"/>
     <w:tmpl w:val="CEFC31A0"/>
@@ -4309,7 +4978,7 @@
       </w:rPr>
     </w:lvl>
   </w:abstractNum>
-  <w:abstractNum w:abstractNumId="18" w15:restartNumberingAfterBreak="0">
+  <w:abstractNum w:abstractNumId="21" w15:restartNumberingAfterBreak="0">
     <w:nsid w:val="7EE902B5"/>
     <w:multiLevelType w:val="hybridMultilevel"/>
     <w:tmpl w:val="189C6112"/>
@@ -4450,34 +5119,43 @@
     <w:abstractNumId w:val="0"/>
   </w:num>
   <w:num w:numId="10" w16cid:durableId="320354454">
-    <w:abstractNumId w:val="18"/>
+    <w:abstractNumId w:val="21"/>
   </w:num>
   <w:num w:numId="11" w16cid:durableId="1401561372">
-    <w:abstractNumId w:val="14"/>
+    <w:abstractNumId w:val="17"/>
   </w:num>
   <w:num w:numId="12" w16cid:durableId="1286277930">
-    <w:abstractNumId w:val="16"/>
+    <w:abstractNumId w:val="19"/>
   </w:num>
   <w:num w:numId="13" w16cid:durableId="1468278381">
     <w:abstractNumId w:val="9"/>
   </w:num>
   <w:num w:numId="14" w16cid:durableId="405498538">
+    <w:abstractNumId w:val="14"/>
+  </w:num>
+  <w:num w:numId="15" w16cid:durableId="1580018906">
+    <w:abstractNumId w:val="18"/>
+  </w:num>
+  <w:num w:numId="16" w16cid:durableId="803235660">
+    <w:abstractNumId w:val="11"/>
+  </w:num>
+  <w:num w:numId="17" w16cid:durableId="1707875731">
     <w:abstractNumId w:val="13"/>
   </w:num>
-  <w:num w:numId="15" w16cid:durableId="1580018906">
+  <w:num w:numId="18" w16cid:durableId="1355570628">
+    <w:abstractNumId w:val="12"/>
+  </w:num>
+  <w:num w:numId="19" w16cid:durableId="1334339250">
+    <w:abstractNumId w:val="20"/>
+  </w:num>
+  <w:num w:numId="20" w16cid:durableId="767240555">
     <w:abstractNumId w:val="15"/>
   </w:num>
-  <w:num w:numId="16" w16cid:durableId="803235660">
+  <w:num w:numId="21" w16cid:durableId="1165630874">
+    <w:abstractNumId w:val="16"/>
+  </w:num>
+  <w:num w:numId="22" w16cid:durableId="121388396">
     <w:abstractNumId w:val="10"/>
-  </w:num>
-  <w:num w:numId="17" w16cid:durableId="1707875731">
-    <w:abstractNumId w:val="12"/>
-  </w:num>
-  <w:num w:numId="18" w16cid:durableId="1355570628">
-    <w:abstractNumId w:val="11"/>
-  </w:num>
-  <w:num w:numId="19" w16cid:durableId="1334339250">
-    <w:abstractNumId w:val="17"/>
   </w:num>
 </w:numbering>
 </file>

</xml_diff>

<commit_message>
mexi principalmente no final do texto
</commit_message>
<xml_diff>
--- a/output_final/Uma política de fomento baseada em evidências_v6.docx
+++ b/output_final/Uma política de fomento baseada em evidências_v6.docx
@@ -2767,13 +2767,11 @@
         <w:lastRenderedPageBreak/>
         <w:t xml:space="preserve">normativos, atendimento dos órgãos de controle. A Ancine hoje tem a capacidade de operar 1B por ano com ticket médio baixo e com grau de complexidade alto. Não é verdade que os servidores mudam de função com uma frequência que traga algum impacto. Se o problema é a instabilidade você pode ter certeza </w:t>
       </w:r>
-      <w:proofErr w:type="gramStart"/>
-      <w:r>
-        <w:t>que</w:t>
-      </w:r>
-      <w:proofErr w:type="gramEnd"/>
-      <w:r>
-        <w:t xml:space="preserve"> não </w:t>
+      <w:r>
+        <w:t xml:space="preserve">de </w:t>
+      </w:r>
+      <w:r>
+        <w:t xml:space="preserve">que não </w:t>
       </w:r>
       <w:r>
         <w:t>es</w:t>
@@ -2888,29 +2886,38 @@
         <w:t>Plano Plurianual – O CGFSA precisaria ter um planejamento que transitasse de um governo para o outro</w:t>
       </w:r>
       <w:r>
-        <w:t xml:space="preserve"> (o que dependeria de um decreto presidencial). Ou no mínimo que o seu regimento estabelecesse planejamentos plurianuais (divididos em </w:t>
+        <w:t xml:space="preserve"> (o que dependeria de um decreto presidencial). Ou no mínimo que o seu regimento estabelecesse planejamentos plurianuais (divididos em anuai</w:t>
+      </w:r>
+      <w:r>
+        <w:t>s</w:t>
+      </w:r>
+      <w:r>
+        <w:t xml:space="preserve"> para atender o decreto). </w:t>
+      </w:r>
+      <w:r>
+        <w:t>A transparência deveria vir justamente do CSC e CGFSA dizerem qual é a estratégia de investimento a longo prazo. Planos de 5, 10 anos que ultrapassem governos. E se o plano não for possível por contingenciamento que se registre e o CGFSA determina onde vai cortar.</w:t>
+      </w:r>
+      <w:r>
+        <w:t xml:space="preserve"> Agora ter </w:t>
       </w:r>
       <w:proofErr w:type="spellStart"/>
       <w:r>
-        <w:t>anuai</w:t>
+        <w:t>PAIs</w:t>
       </w:r>
       <w:proofErr w:type="spellEnd"/>
       <w:r>
-        <w:t xml:space="preserve"> para atender o decreto). </w:t>
-      </w:r>
-      <w:r>
-        <w:t>A transparência deveria vir justamente do CSC e CGFSA dizerem qual é a estratégia de investimento a longo prazo. Planos de 5, 10 anos que ultrapassem governos. E se o plano não for possível por contingenciamento que se registre e o CGFSA determina onde vai cortar.</w:t>
-      </w:r>
-      <w:r>
-        <w:t xml:space="preserve"> Agora ter </w:t>
-      </w:r>
-      <w:proofErr w:type="spellStart"/>
-      <w:r>
-        <w:t>PAIs</w:t>
-      </w:r>
-      <w:proofErr w:type="spellEnd"/>
-      <w:r>
-        <w:t xml:space="preserve"> tão diferentes ano a ano</w:t>
+        <w:t xml:space="preserve"> tão </w:t>
+      </w:r>
+      <w:proofErr w:type="gramStart"/>
+      <w:r>
+        <w:t>diferentes ano</w:t>
+      </w:r>
+      <w:proofErr w:type="gramEnd"/>
+      <w:r>
+        <w:t xml:space="preserve"> a ano</w:t>
+      </w:r>
+      <w:r>
+        <w:t>, e mudanças radicais a cada quatro, não tem como ser em nome dos melhores interesses do próprio fundo.</w:t>
       </w:r>
     </w:p>
     <w:p>
@@ -2922,7 +2929,23 @@
         </w:numPr>
       </w:pPr>
       <w:r>
-        <w:t xml:space="preserve">Transparência – As atas não são suficientes. As reuniões precisam ser públicas com transmissão ao vivo. E as decisões precisam ser motivadas a partir de estudos que possam estar à disposição do escrutínio público. </w:t>
+        <w:t>Transparência – As atas não são suficientes. As reuniões precisam ser públicas</w:t>
+      </w:r>
+      <w:r>
+        <w:t xml:space="preserve"> e</w:t>
+      </w:r>
+      <w:r>
+        <w:t xml:space="preserve"> com transmissão ao vivo</w:t>
+      </w:r>
+      <w:r>
+        <w:t xml:space="preserve">, da mesma forma que já acontece nas reuniões de </w:t>
+      </w:r>
+      <w:r>
+        <w:lastRenderedPageBreak/>
+        <w:t>diretoria colegiada da Ancine</w:t>
+      </w:r>
+      <w:r>
+        <w:t xml:space="preserve">. E as decisões precisam ser motivadas a partir de estudos que possam estar à disposição do escrutínio público. </w:t>
       </w:r>
     </w:p>
     <w:p>
@@ -2934,8 +2957,30 @@
         </w:numPr>
       </w:pPr>
       <w:r>
-        <w:lastRenderedPageBreak/>
-        <w:t xml:space="preserve">Conflito de Interesses – Não me interessa a fulanização, mas é comum que experts do setor tenham cadeira no CGFSA que determina as regras dos editais e depois as suas empresas participam dos editais que elas aprovaram. Todas as informações necessárias para se cruzar essa informação são públicas. Só pegar a lista de todos os que já participaram do Comite aqui </w:t>
+        <w:t xml:space="preserve">Conflito de Interesses – Não me interessa a fulanização, mas é comum que experts do setor tenham cadeira no CGFSA </w:t>
+      </w:r>
+      <w:r>
+        <w:t>e votam sobre</w:t>
+      </w:r>
+      <w:r>
+        <w:t xml:space="preserve"> as regras dos editais e depois as suas empresas participam </w:t>
+      </w:r>
+      <w:r>
+        <w:t>desses</w:t>
+      </w:r>
+      <w:r>
+        <w:t xml:space="preserve"> editais. </w:t>
+      </w:r>
+      <w:r>
+        <w:t>É um conflito evidente, que precisa ser saneado.</w:t>
+      </w:r>
+    </w:p>
+    <w:p>
+      <w:pPr>
+        <w:pStyle w:val="PargrafodaLista"/>
+      </w:pPr>
+      <w:r>
+        <w:t xml:space="preserve">Todas as informações necessárias para se cruzar essa informação são públicas. Só pegar a lista de todos os que já participaram do Comite aqui </w:t>
       </w:r>
       <w:hyperlink r:id="rId14" w:history="1">
         <w:r>
@@ -3038,7 +3083,18 @@
         <w:t>No mínimo uma distribuidora e duas produtoras juntam os pontos dos seus desempenhos pretéritos (seja bilheteria, festival internacional ou outros dados) e apresentam uma proposta de contrato de longa duração aonde essa nova empresa vai desenvolver, produzir e lançar uma carteira de obras.</w:t>
       </w:r>
       <w:r>
-        <w:t xml:space="preserve"> O que enxergo de vantagem nessa proposta:</w:t>
+        <w:t xml:space="preserve"> </w:t>
+      </w:r>
+    </w:p>
+    <w:p>
+      <w:r>
+        <w:t>O que enxergo de vantagem nes</w:t>
+      </w:r>
+      <w:r>
+        <w:t>t</w:t>
+      </w:r>
+      <w:r>
+        <w:t>a proposta:</w:t>
       </w:r>
     </w:p>
     <w:p>
@@ -3053,6 +3109,9 @@
         <w:t>Previsibilidade e planejamento de longo prazo</w:t>
       </w:r>
       <w:r>
+        <w:t xml:space="preserve"> para as empresas</w:t>
+      </w:r>
+      <w:r>
         <w:t>.</w:t>
       </w:r>
     </w:p>
@@ -3065,10 +3124,10 @@
         </w:numPr>
       </w:pPr>
       <w:r>
-        <w:t>Ganhos de escala e escopo na produção</w:t>
-      </w:r>
-      <w:r>
-        <w:t xml:space="preserve"> e distribuição – margem de negociação com fornecedores, melhor alocação de recursos humanos etc.</w:t>
+        <w:t xml:space="preserve">FSA comprometido contratualmente a manter o fluxo anual </w:t>
+      </w:r>
+      <w:r>
+        <w:t xml:space="preserve">para essas empresas sob o risco de quebra de contrato. </w:t>
       </w:r>
     </w:p>
     <w:p>
@@ -3080,13 +3139,10 @@
         </w:numPr>
       </w:pPr>
       <w:r>
-        <w:t xml:space="preserve">Estruturação financeira de produção e distribuição apresentadas ao mesmo tempo, </w:t>
-      </w:r>
-      <w:r>
-        <w:t>meta de</w:t>
-      </w:r>
-      <w:r>
-        <w:t xml:space="preserve"> 50/50 dependendo da característica da carteira.</w:t>
+        <w:t>Ganhos de escala e escopo na produção</w:t>
+      </w:r>
+      <w:r>
+        <w:t xml:space="preserve"> e distribuição – margem de negociação com fornecedores, melhor alocação de recursos humanos etc.</w:t>
       </w:r>
     </w:p>
     <w:p>
@@ -3098,7 +3154,13 @@
         </w:numPr>
       </w:pPr>
       <w:r>
-        <w:t>Novas possibilidades de investimento em infraestrutura e empregos qualificados.</w:t>
+        <w:t xml:space="preserve">Estruturação financeira de produção e distribuição apresentadas ao mesmo tempo, </w:t>
+      </w:r>
+      <w:r>
+        <w:t>meta de</w:t>
+      </w:r>
+      <w:r>
+        <w:t xml:space="preserve"> 50/50 dependendo da característica da carteira.</w:t>
       </w:r>
     </w:p>
     <w:p>
@@ -3110,7 +3172,7 @@
         </w:numPr>
       </w:pPr>
       <w:r>
-        <w:t>Prestação de contas mais rigorosa do ponto de vista de governança como meta de empregos qualificado gerados, diversidade.</w:t>
+        <w:t>Novas possibilidades de investimento em infraestrutura e empregos qualificados.</w:t>
       </w:r>
     </w:p>
     <w:p>
@@ -3122,60 +3184,105 @@
         </w:numPr>
       </w:pPr>
       <w:r>
-        <w:t xml:space="preserve">Renovação depende do desempenho da própria carteira. </w:t>
+        <w:t xml:space="preserve">Prestação de contas mais </w:t>
+      </w:r>
+      <w:r>
+        <w:t>qualificada</w:t>
+      </w:r>
+      <w:r>
+        <w:t xml:space="preserve"> do ponto de vista de governança como meta de empregos qualificado gerados</w:t>
+      </w:r>
+      <w:r>
+        <w:t xml:space="preserve"> (RAI)</w:t>
+      </w:r>
+      <w:r>
+        <w:t>, diversidade</w:t>
+      </w:r>
+      <w:r>
+        <w:t>, análise de balanço</w:t>
+      </w:r>
+      <w:r>
+        <w:t>.</w:t>
       </w:r>
     </w:p>
     <w:p>
-      <w:r>
-        <w:t xml:space="preserve">A única questão é que os dados mostram </w:t>
-      </w:r>
-      <w:r>
-        <w:t>que o interesse público não</w:t>
+      <w:pPr>
+        <w:pStyle w:val="PargrafodaLista"/>
+        <w:numPr>
+          <w:ilvl w:val="0"/>
+          <w:numId w:val="14"/>
+        </w:numPr>
+      </w:pPr>
+      <w:r>
+        <w:t xml:space="preserve">Renovação depende do desempenho da própria carteira. </w:t>
+      </w:r>
+    </w:p>
+    <w:p>
+      <w:r>
+        <w:lastRenderedPageBreak/>
+        <w:t>Agora,</w:t>
+      </w:r>
+      <w:r>
+        <w:t xml:space="preserve"> os dados mostram </w:t>
+      </w:r>
+      <w:r>
+        <w:t xml:space="preserve">que </w:t>
+      </w:r>
+      <w:r>
+        <w:t xml:space="preserve">a </w:t>
+      </w:r>
+      <w:r>
+        <w:t xml:space="preserve">avaliação </w:t>
+      </w:r>
+      <w:r>
+        <w:t xml:space="preserve">através de leitura humana dos </w:t>
+      </w:r>
+      <w:r>
+        <w:t>roteiro</w:t>
+      </w:r>
+      <w:r>
+        <w:t>s</w:t>
+      </w:r>
+      <w:r>
+        <w:t xml:space="preserve"> é fundamental e </w:t>
+      </w:r>
+      <w:r>
+        <w:t xml:space="preserve">o poder público não pode </w:t>
+      </w:r>
+      <w:proofErr w:type="gramStart"/>
+      <w:r>
+        <w:t>abrir mão de</w:t>
+      </w:r>
+      <w:proofErr w:type="gramEnd"/>
+      <w:r>
+        <w:t xml:space="preserve"> definir exatamente qual vai ser a maior parte da carteira de investimento do ano</w:t>
+      </w:r>
+      <w:r>
+        <w:t>, mesmo entre as empresas de alto desempenho</w:t>
+      </w:r>
+      <w:r>
+        <w:t xml:space="preserve">. A carteira apresentada passa por uma avaliação de comitê aonde todas as SPEs competem tanto pelos seus desempenhos pretéritos, como </w:t>
+      </w:r>
+      <w:r>
+        <w:t>pel</w:t>
+      </w:r>
+      <w:r>
+        <w:t>a</w:t>
+      </w:r>
+      <w:r>
+        <w:t>s</w:t>
+      </w:r>
+      <w:r>
+        <w:t xml:space="preserve"> suas propostas de carteira. O Comitê de Investimento tem nas mãos o que deve ser, em tese, os melhores projetos das empresas de melhor desempenho dos últimos anos e elege entre elas as melhores propostas de cada uma</w:t>
       </w:r>
       <w:r>
         <w:t xml:space="preserve"> </w:t>
       </w:r>
       <w:r>
-        <w:t>permite que se</w:t>
+        <w:t xml:space="preserve">de acordo com as metas de obras que o CGFSA determinar. </w:t>
       </w:r>
       <w:r>
         <w:t xml:space="preserve"> </w:t>
-      </w:r>
-      <w:proofErr w:type="gramStart"/>
-      <w:r>
-        <w:t>abr</w:t>
-      </w:r>
-      <w:r>
-        <w:t>a</w:t>
-      </w:r>
-      <w:r>
-        <w:t xml:space="preserve"> mão da</w:t>
-      </w:r>
-      <w:proofErr w:type="gramEnd"/>
-      <w:r>
-        <w:t xml:space="preserve"> avaliação externa nem nos casos de empresas já consagradas. A carteira apresentada passa por uma avaliação de comitê aonde todas as SPEs competem tanto pelos seus desempenhos pretéritos, como </w:t>
-      </w:r>
-      <w:r>
-        <w:t>pel</w:t>
-      </w:r>
-      <w:r>
-        <w:t>a</w:t>
-      </w:r>
-      <w:r>
-        <w:t>s</w:t>
-      </w:r>
-      <w:r>
-        <w:t xml:space="preserve"> suas propostas de carteira. O Comitê de Investimento tem nas mãos o que deve ser, em tese, os melhores projetos das empresas </w:t>
-      </w:r>
-      <w:r>
-        <w:lastRenderedPageBreak/>
-        <w:t>de melhor desempenho dos últimos anos e elege entre elas as melhores propostas de cada uma</w:t>
-      </w:r>
-      <w:r>
-        <w:t xml:space="preserve"> ou as que melhor preencham os propósitos mais republicanos da política audiovisual brasileira</w:t>
-      </w:r>
-      <w:r>
-        <w:t xml:space="preserve">. </w:t>
       </w:r>
     </w:p>
     <w:p>
@@ -3263,13 +3370,15 @@
       <w:r>
         <w:t xml:space="preserve">As evidências estão no painel, mas eu tinha certeza </w:t>
       </w:r>
-      <w:proofErr w:type="gramStart"/>
-      <w:r>
-        <w:t>que</w:t>
-      </w:r>
-      <w:proofErr w:type="gramEnd"/>
-      <w:r>
-        <w:t xml:space="preserve"> encontraria dados fortes por puro empirismo. Sou capaz de citar vários nomes de selecionados em longas que foram antes selecionados em curtas: Kleber Mendonça Filho, Caetano Gotardo, Guto Parente, Marcelo Caetano, Juliana Rojas, Marco Dutra, Thais </w:t>
+      <w:r>
+        <w:t xml:space="preserve">de </w:t>
+      </w:r>
+      <w:r>
+        <w:t xml:space="preserve">que encontraria dados fortes por puro empirismo. Sou capaz de citar vários nomes de selecionados em longas que foram antes selecionados em curtas: Kleber Mendonça Filho, Caetano Gotardo, Guto Parente, Marcelo Caetano, Juliana Rojas, </w:t>
+      </w:r>
+      <w:r>
+        <w:lastRenderedPageBreak/>
+        <w:t xml:space="preserve">Marco Dutra, Thais </w:t>
       </w:r>
       <w:proofErr w:type="spellStart"/>
       <w:r>
@@ -3288,38 +3397,26 @@
         <w:t xml:space="preserve"> Muritiba, Anitta Rocha, André Novais, Gabriel Martins</w:t>
       </w:r>
       <w:r>
-        <w:t xml:space="preserve">. Não importa a referência, seja entre os selecionados em longas de forma geral, seja entre os 400 curtas produzidos por ano, </w:t>
-      </w:r>
-      <w:r>
-        <w:t xml:space="preserve">só entre esses nomes </w:t>
-      </w:r>
-      <w:r>
-        <w:t xml:space="preserve">a correlação é óbvia. </w:t>
+        <w:t xml:space="preserve">. </w:t>
       </w:r>
     </w:p>
     <w:p>
       <w:r>
-        <w:t xml:space="preserve">Uma forma de quebrar a barreira de entrada e aproveitar uma seleção em um grande festival que tem mais chance de emplacar uma seleção em longas é abrindo um SUAT </w:t>
-      </w:r>
-      <w:r>
-        <w:lastRenderedPageBreak/>
-        <w:t>que mede o desempenho de curtas e acelera o primeiro longa de uma nova geração que já rompeu uma primeira e difícil barreira no mercado internacional e nacional.</w:t>
+        <w:t xml:space="preserve">Uma forma de quebrar a barreira de entrada </w:t>
+      </w:r>
+      <w:r>
+        <w:t xml:space="preserve">seria </w:t>
+      </w:r>
+      <w:r>
+        <w:t>aproveitar uma seleção em um grande festival que tem mais chance de emplacar uma seleção em longas é abrindo um SUAT que mede o desempenho de curtas e acelera o primeiro longa de uma nova geração que já rompeu uma primeira e difícil barreira no mercado internacional e nacional.</w:t>
       </w:r>
     </w:p>
     <w:p>
       <w:r>
-        <w:t xml:space="preserve">Como princípio não se </w:t>
-      </w:r>
-      <w:proofErr w:type="gramStart"/>
-      <w:r>
-        <w:t>abre mão da</w:t>
-      </w:r>
-      <w:proofErr w:type="gramEnd"/>
-      <w:r>
-        <w:t xml:space="preserve"> fase de avaliação </w:t>
-      </w:r>
-      <w:r>
-        <w:t xml:space="preserve">humana, mas transmite uma forte mensagem para quem </w:t>
+        <w:t>T</w:t>
+      </w:r>
+      <w:r>
+        <w:t xml:space="preserve">ransmite uma forte mensagem para quem </w:t>
       </w:r>
       <w:proofErr w:type="gramStart"/>
       <w:r>
@@ -3341,6 +3438,12 @@
         <w:t>E aqui reside algo curioso, a volta do CPF como o centro, pelo menos em parte. Acho que a direção tem que ter a sua participação no investimento garantida, já que nessa etapa é muito mais determinante do que a produtora.</w:t>
       </w:r>
     </w:p>
+    <w:p>
+      <w:r>
+        <w:t xml:space="preserve">Não desconsidero que talvez para longas visando internacionalização também essa seja boa prática. </w:t>
+      </w:r>
+    </w:p>
+    <w:p/>
     <w:p>
       <w:pPr>
         <w:pStyle w:val="PargrafodaLista"/>
@@ -3461,6 +3564,7 @@
     <w:p/>
     <w:p>
       <w:r>
+        <w:lastRenderedPageBreak/>
         <w:t xml:space="preserve">Se supormos um ticket médio desejável de 5M (só a parte do FSA) e que podemos ter como meta 150 filmes lançados com financiamento do FSA, estamos falando de 750 milhões. No último PAI foi 500M para o </w:t>
       </w:r>
       <w:proofErr w:type="spellStart"/>
@@ -3472,88 +3576,6 @@
         <w:t xml:space="preserve">, não estamos tão longe. </w:t>
       </w:r>
     </w:p>
-    <w:p>
-      <w:r>
-        <w:t>Uma distribuição possível:</w:t>
-      </w:r>
-    </w:p>
-    <w:p>
-      <w:pPr>
-        <w:pStyle w:val="PargrafodaLista"/>
-        <w:numPr>
-          <w:ilvl w:val="0"/>
-          <w:numId w:val="16"/>
-        </w:numPr>
-      </w:pPr>
-      <w:r>
-        <w:t>SPEs 250M produção + 250M distribuição</w:t>
-      </w:r>
-    </w:p>
-    <w:p>
-      <w:pPr>
-        <w:pStyle w:val="PargrafodaLista"/>
-        <w:numPr>
-          <w:ilvl w:val="0"/>
-          <w:numId w:val="16"/>
-        </w:numPr>
-      </w:pPr>
-      <w:r>
-        <w:t>Seletivo</w:t>
-      </w:r>
-      <w:r>
-        <w:t xml:space="preserve"> produção </w:t>
-      </w:r>
-      <w:r>
-        <w:t>100M</w:t>
-      </w:r>
-    </w:p>
-    <w:p>
-      <w:pPr>
-        <w:pStyle w:val="PargrafodaLista"/>
-        <w:numPr>
-          <w:ilvl w:val="0"/>
-          <w:numId w:val="16"/>
-        </w:numPr>
-      </w:pPr>
-      <w:r>
-        <w:t>S</w:t>
-      </w:r>
-      <w:r>
-        <w:t>eletivo</w:t>
-      </w:r>
-      <w:r>
-        <w:t xml:space="preserve"> comercialização</w:t>
-      </w:r>
-      <w:r>
-        <w:t xml:space="preserve"> 80M</w:t>
-      </w:r>
-    </w:p>
-    <w:p>
-      <w:pPr>
-        <w:pStyle w:val="PargrafodaLista"/>
-        <w:numPr>
-          <w:ilvl w:val="0"/>
-          <w:numId w:val="16"/>
-        </w:numPr>
-      </w:pPr>
-      <w:r>
-        <w:lastRenderedPageBreak/>
-        <w:t>Ampla concorrência 50M</w:t>
-      </w:r>
-    </w:p>
-    <w:p>
-      <w:pPr>
-        <w:pStyle w:val="PargrafodaLista"/>
-        <w:numPr>
-          <w:ilvl w:val="0"/>
-          <w:numId w:val="16"/>
-        </w:numPr>
-      </w:pPr>
-      <w:r>
-        <w:t>SUAT Curtas 20M</w:t>
-      </w:r>
-    </w:p>
-    <w:p/>
     <w:p>
       <w:pPr>
         <w:jc w:val="center"/>

</xml_diff>